<commit_message>
M2 post-validation report: remove proxy/M3 references
The client-facing report and cover note must not assume Milestone 3 work
exists — M3 is being requested separately, alongside this report. Point 2's
"origin of 503" and "next-stage handling" reworded to stand on their own:
the app calls Gemini directly; the retry/latency hardening is a self-contained
transport-layer pass. No change to findings or diagnosis.

Co-Authored-By: Claude Sonnet 5 <noreply@anthropic.com>
</commit_message>
<xml_diff>
--- a/docs/ApiSave_M2_Postvalidation_Observations.docx
+++ b/docs/ApiSave_M2_Postvalidation_Observations.docx
@@ -2480,7 +2480,7 @@
         <w:t xml:space="preserve"> </w:t>
       </w:r>
       <w:r>
-        <w:t xml:space="preserve">The M2 build calls</w:t>
+        <w:t xml:space="preserve">The app calls</w:t>
       </w:r>
       <w:r>
         <w:t xml:space="preserve"> </w:t>
@@ -2495,25 +2495,19 @@
         <w:t xml:space="preserve"> </w:t>
       </w:r>
       <w:r>
-        <w:t xml:space="preserve">directly (the</w:t>
-      </w:r>
-      <w:r>
-        <w:t xml:space="preserve"> </w:t>
-      </w:r>
-      <w:r>
-        <w:t xml:space="preserve">server-side proxy is M3 and is not deployed). HTTP 503 from that endpoint means the model is</w:t>
-      </w:r>
-      <w:r>
-        <w:t xml:space="preserve"> </w:t>
-      </w:r>
-      <w:r>
-        <w:t xml:space="preserve">temporarily overloaded on Google’s side. It is not the application and not a backend of</w:t>
-      </w:r>
-      <w:r>
-        <w:t xml:space="preserve"> </w:t>
-      </w:r>
-      <w:r>
-        <w:t xml:space="preserve">ours. It is transient and not correlated with our request pattern.</w:t>
+        <w:t xml:space="preserve">directly. HTTP 503 from</w:t>
+      </w:r>
+      <w:r>
+        <w:t xml:space="preserve"> </w:t>
+      </w:r>
+      <w:r>
+        <w:t xml:space="preserve">that endpoint means the model is temporarily overloaded on Google’s side. It is not the</w:t>
+      </w:r>
+      <w:r>
+        <w:t xml:space="preserve"> </w:t>
+      </w:r>
+      <w:r>
+        <w:t xml:space="preserve">application’s own code, and it is transient and not correlated with our request pattern.</w:t>
       </w:r>
     </w:p>
     <w:bookmarkEnd w:id="17"/>
@@ -2957,19 +2951,13 @@
         <w:pStyle w:val="FirstParagraph"/>
       </w:pPr>
       <w:r>
-        <w:t xml:space="preserve">This is transport-layer work and touches no detection logic. It can be a small standalone</w:t>
-      </w:r>
-      <w:r>
-        <w:t xml:space="preserve"> </w:t>
-      </w:r>
-      <w:r>
-        <w:t xml:space="preserve">hardening pass or folded into M3 (the proxy is the natural home for retry and latency</w:t>
-      </w:r>
-      <w:r>
-        <w:t xml:space="preserve"> </w:t>
-      </w:r>
-      <w:r>
-        <w:t xml:space="preserve">policy). Scope:</w:t>
+        <w:t xml:space="preserve">This is transport-layer work and touches no detection logic — a self-contained hardening</w:t>
+      </w:r>
+      <w:r>
+        <w:t xml:space="preserve"> </w:t>
+      </w:r>
+      <w:r>
+        <w:t xml:space="preserve">pass. Scope:</w:t>
       </w:r>
     </w:p>
     <w:p>

</xml_diff>